<commit_message>
Entries page title FE changes ,libraries and css changes.
</commit_message>
<xml_diff>
--- a/DailyScribeNotesReleaseNotesAndBugs.docx
+++ b/DailyScribeNotesReleaseNotesAndBugs.docx
@@ -23,7 +23,6 @@
       <w:r>
         <w:tab/>
       </w:r>
-      <w:proofErr w:type="spellStart"/>
       <w:r>
         <w:rPr>
           <w:b/>
@@ -31,17 +30,7 @@
           <w:sz w:val="40"/>
           <w:szCs w:val="40"/>
         </w:rPr>
-        <w:t>DailyScribe</w:t>
-      </w:r>
-      <w:proofErr w:type="spellEnd"/>
-      <w:r>
-        <w:rPr>
-          <w:b/>
-          <w:bCs/>
-          <w:sz w:val="40"/>
-          <w:szCs w:val="40"/>
-        </w:rPr>
-        <w:t xml:space="preserve"> Project</w:t>
+        <w:t>DailyScribe Project</w:t>
       </w:r>
     </w:p>
     <w:p/>
@@ -172,23 +161,7 @@
           <w:sz w:val="20"/>
           <w:szCs w:val="20"/>
         </w:rPr>
-        <w:t xml:space="preserve"> function wasn’t populating the text field. The </w:t>
-      </w:r>
-      <w:proofErr w:type="spellStart"/>
-      <w:r>
-        <w:rPr>
-          <w:sz w:val="20"/>
-          <w:szCs w:val="20"/>
-        </w:rPr>
-        <w:t>handleEdit</w:t>
-      </w:r>
-      <w:proofErr w:type="spellEnd"/>
-      <w:r>
-        <w:rPr>
-          <w:sz w:val="20"/>
-          <w:szCs w:val="20"/>
-        </w:rPr>
-        <w:t xml:space="preserve"> method has been updated to correctly load existing content for editing.</w:t>
+        <w:t xml:space="preserve"> function wasn’t populating the text field. The handleEdit method has been updated to correctly load existing content for editing.</w:t>
       </w:r>
     </w:p>
     <w:p>
@@ -288,6 +261,72 @@
         </w:rPr>
         <w:t xml:space="preserve"> when viewing a journal entry to enhance user engagement and visual appeal.</w:t>
       </w:r>
+    </w:p>
+    <w:p>
+      <w:pPr>
+        <w:rPr>
+          <w:sz w:val="20"/>
+          <w:szCs w:val="20"/>
+        </w:rPr>
+      </w:pPr>
+      <w:r>
+        <w:rPr>
+          <w:b/>
+          <w:bCs/>
+          <w:sz w:val="20"/>
+          <w:szCs w:val="20"/>
+        </w:rPr>
+        <w:t>5</w:t>
+      </w:r>
+      <w:r>
+        <w:rPr>
+          <w:b/>
+          <w:bCs/>
+          <w:sz w:val="20"/>
+          <w:szCs w:val="20"/>
+        </w:rPr>
+        <w:t xml:space="preserve">. </w:t>
+      </w:r>
+      <w:r>
+        <w:rPr>
+          <w:b/>
+          <w:bCs/>
+          <w:sz w:val="20"/>
+          <w:szCs w:val="20"/>
+        </w:rPr>
+        <w:t xml:space="preserve">Sorting feature based on dates </w:t>
+      </w:r>
+      <w:r>
+        <w:rPr>
+          <w:b/>
+          <w:bCs/>
+          <w:sz w:val="20"/>
+          <w:szCs w:val="20"/>
+        </w:rPr>
+        <w:t>:</w:t>
+      </w:r>
+      <w:r>
+        <w:rPr>
+          <w:sz w:val="20"/>
+          <w:szCs w:val="20"/>
+        </w:rPr>
+        <w:br/>
+      </w:r>
+      <w:r>
+        <w:rPr>
+          <w:sz w:val="20"/>
+          <w:szCs w:val="20"/>
+        </w:rPr>
+        <w:t>Adding a sorting feature next to search bar to sort based on dates.</w:t>
+      </w:r>
+    </w:p>
+    <w:p>
+      <w:pPr>
+        <w:rPr>
+          <w:sz w:val="20"/>
+          <w:szCs w:val="20"/>
+        </w:rPr>
+      </w:pPr>
     </w:p>
     <w:p>
       <w:pPr>
@@ -910,6 +949,7 @@
   <w:style w:type="character" w:default="1" w:styleId="DefaultParagraphFont">
     <w:name w:val="Default Paragraph Font"/>
     <w:uiPriority w:val="1"/>
+    <w:semiHidden/>
     <w:unhideWhenUsed/>
   </w:style>
   <w:style w:type="table" w:default="1" w:styleId="TableNormal">

</xml_diff>

<commit_message>
Handling edit journal and css changes.
</commit_message>
<xml_diff>
--- a/DailyScribeNotesReleaseNotesAndBugs.docx
+++ b/DailyScribeNotesReleaseNotesAndBugs.docx
@@ -23,6 +23,7 @@
       <w:r>
         <w:tab/>
       </w:r>
+      <w:proofErr w:type="spellStart"/>
       <w:r>
         <w:rPr>
           <w:b/>
@@ -30,7 +31,17 @@
           <w:sz w:val="40"/>
           <w:szCs w:val="40"/>
         </w:rPr>
-        <w:t>DailyScribe Project</w:t>
+        <w:t>DailyScribe</w:t>
+      </w:r>
+      <w:proofErr w:type="spellEnd"/>
+      <w:r>
+        <w:rPr>
+          <w:b/>
+          <w:bCs/>
+          <w:sz w:val="40"/>
+          <w:szCs w:val="40"/>
+        </w:rPr>
+        <w:t xml:space="preserve"> Project</w:t>
       </w:r>
     </w:p>
     <w:p/>
@@ -161,7 +172,23 @@
           <w:sz w:val="20"/>
           <w:szCs w:val="20"/>
         </w:rPr>
-        <w:t xml:space="preserve"> function wasn’t populating the text field. The handleEdit method has been updated to correctly load existing content for editing.</w:t>
+        <w:t xml:space="preserve"> function wasn’t populating the text field. The </w:t>
+      </w:r>
+      <w:proofErr w:type="spellStart"/>
+      <w:r>
+        <w:rPr>
+          <w:sz w:val="20"/>
+          <w:szCs w:val="20"/>
+        </w:rPr>
+        <w:t>handleEdit</w:t>
+      </w:r>
+      <w:proofErr w:type="spellEnd"/>
+      <w:r>
+        <w:rPr>
+          <w:sz w:val="20"/>
+          <w:szCs w:val="20"/>
+        </w:rPr>
+        <w:t xml:space="preserve"> method has been updated to correctly load existing content for editing.</w:t>
       </w:r>
     </w:p>
     <w:p>
@@ -220,6 +247,29 @@
         </w:rPr>
         <w:t xml:space="preserve"> for better clarity, aesthetics, and overall user friendliness.</w:t>
       </w:r>
+      <w:r>
+        <w:rPr>
+          <w:sz w:val="20"/>
+          <w:szCs w:val="20"/>
+        </w:rPr>
+        <w:t xml:space="preserve"> (</w:t>
+      </w:r>
+      <w:proofErr w:type="spellStart"/>
+      <w:r>
+        <w:rPr>
+          <w:sz w:val="20"/>
+          <w:szCs w:val="20"/>
+        </w:rPr>
+        <w:t>Css</w:t>
+      </w:r>
+      <w:proofErr w:type="spellEnd"/>
+      <w:r>
+        <w:rPr>
+          <w:sz w:val="20"/>
+          <w:szCs w:val="20"/>
+        </w:rPr>
+        <w:t xml:space="preserve"> for edit journal part Important)</w:t>
+      </w:r>
     </w:p>
     <w:p>
       <w:pPr>
@@ -294,7 +344,17 @@
           <w:sz w:val="20"/>
           <w:szCs w:val="20"/>
         </w:rPr>
-        <w:t xml:space="preserve">Sorting feature based on dates </w:t>
+        <w:t xml:space="preserve">Sorting feature based on </w:t>
+      </w:r>
+      <w:proofErr w:type="gramStart"/>
+      <w:r>
+        <w:rPr>
+          <w:b/>
+          <w:bCs/>
+          <w:sz w:val="20"/>
+          <w:szCs w:val="20"/>
+        </w:rPr>
+        <w:t xml:space="preserve">dates </w:t>
       </w:r>
       <w:r>
         <w:rPr>
@@ -305,6 +365,7 @@
         </w:rPr>
         <w:t>:</w:t>
       </w:r>
+      <w:proofErr w:type="gramEnd"/>
       <w:r>
         <w:rPr>
           <w:sz w:val="20"/>

</xml_diff>

<commit_message>
Release notes and version no changes.
</commit_message>
<xml_diff>
--- a/DailyScribeNotesReleaseNotesAndBugs.docx
+++ b/DailyScribeNotesReleaseNotesAndBugs.docx
@@ -23,7 +23,6 @@
       <w:r>
         <w:tab/>
       </w:r>
-      <w:proofErr w:type="spellStart"/>
       <w:r>
         <w:rPr>
           <w:b/>
@@ -31,17 +30,7 @@
           <w:sz w:val="40"/>
           <w:szCs w:val="40"/>
         </w:rPr>
-        <w:t>DailyScribe</w:t>
-      </w:r>
-      <w:proofErr w:type="spellEnd"/>
-      <w:r>
-        <w:rPr>
-          <w:b/>
-          <w:bCs/>
-          <w:sz w:val="40"/>
-          <w:szCs w:val="40"/>
-        </w:rPr>
-        <w:t xml:space="preserve"> Project</w:t>
+        <w:t>DailyScribe Project</w:t>
       </w:r>
     </w:p>
     <w:p/>
@@ -172,23 +161,7 @@
           <w:sz w:val="20"/>
           <w:szCs w:val="20"/>
         </w:rPr>
-        <w:t xml:space="preserve"> function wasn’t populating the text field. The </w:t>
-      </w:r>
-      <w:proofErr w:type="spellStart"/>
-      <w:r>
-        <w:rPr>
-          <w:sz w:val="20"/>
-          <w:szCs w:val="20"/>
-        </w:rPr>
-        <w:t>handleEdit</w:t>
-      </w:r>
-      <w:proofErr w:type="spellEnd"/>
-      <w:r>
-        <w:rPr>
-          <w:sz w:val="20"/>
-          <w:szCs w:val="20"/>
-        </w:rPr>
-        <w:t xml:space="preserve"> method has been updated to correctly load existing content for editing.</w:t>
+        <w:t xml:space="preserve"> function wasn’t populating the text field. The handleEdit method has been updated to correctly load existing content for editing.</w:t>
       </w:r>
     </w:p>
     <w:p>
@@ -252,23 +225,7 @@
           <w:sz w:val="20"/>
           <w:szCs w:val="20"/>
         </w:rPr>
-        <w:t xml:space="preserve"> (</w:t>
-      </w:r>
-      <w:proofErr w:type="spellStart"/>
-      <w:r>
-        <w:rPr>
-          <w:sz w:val="20"/>
-          <w:szCs w:val="20"/>
-        </w:rPr>
-        <w:t>Css</w:t>
-      </w:r>
-      <w:proofErr w:type="spellEnd"/>
-      <w:r>
-        <w:rPr>
-          <w:sz w:val="20"/>
-          <w:szCs w:val="20"/>
-        </w:rPr>
-        <w:t xml:space="preserve"> for edit journal part Important)</w:t>
+        <w:t xml:space="preserve"> (Css for edit journal part Important)</w:t>
       </w:r>
     </w:p>
     <w:p>
@@ -344,17 +301,7 @@
           <w:sz w:val="20"/>
           <w:szCs w:val="20"/>
         </w:rPr>
-        <w:t xml:space="preserve">Sorting feature based on </w:t>
-      </w:r>
-      <w:proofErr w:type="gramStart"/>
-      <w:r>
-        <w:rPr>
-          <w:b/>
-          <w:bCs/>
-          <w:sz w:val="20"/>
-          <w:szCs w:val="20"/>
-        </w:rPr>
-        <w:t xml:space="preserve">dates </w:t>
+        <w:t xml:space="preserve">Sorting feature based on dates </w:t>
       </w:r>
       <w:r>
         <w:rPr>
@@ -365,7 +312,6 @@
         </w:rPr>
         <w:t>:</w:t>
       </w:r>
-      <w:proofErr w:type="gramEnd"/>
       <w:r>
         <w:rPr>
           <w:sz w:val="20"/>
@@ -384,8 +330,150 @@
     <w:p>
       <w:pPr>
         <w:rPr>
-          <w:sz w:val="20"/>
-          <w:szCs w:val="20"/>
+          <w:b/>
+          <w:bCs/>
+          <w:sz w:val="32"/>
+          <w:szCs w:val="32"/>
+        </w:rPr>
+      </w:pPr>
+      <w:r>
+        <w:rPr>
+          <w:b/>
+          <w:bCs/>
+          <w:sz w:val="32"/>
+          <w:szCs w:val="32"/>
+        </w:rPr>
+        <w:t>The first version of the product is built.</w:t>
+      </w:r>
+    </w:p>
+    <w:p>
+      <w:pPr>
+        <w:rPr>
+          <w:b/>
+          <w:bCs/>
+          <w:sz w:val="20"/>
+          <w:szCs w:val="20"/>
+        </w:rPr>
+      </w:pPr>
+      <w:r>
+        <w:rPr>
+          <w:b/>
+          <w:bCs/>
+          <w:sz w:val="20"/>
+          <w:szCs w:val="20"/>
+        </w:rPr>
+        <w:t>Version:1.0.</w:t>
+      </w:r>
+      <w:r>
+        <w:rPr>
+          <w:b/>
+          <w:bCs/>
+          <w:sz w:val="20"/>
+          <w:szCs w:val="20"/>
+        </w:rPr>
+        <w:t>1</w:t>
+      </w:r>
+      <w:r>
+        <w:rPr>
+          <w:b/>
+          <w:bCs/>
+          <w:sz w:val="20"/>
+          <w:szCs w:val="20"/>
+        </w:rPr>
+        <w:t xml:space="preserve"> </w:t>
+      </w:r>
+    </w:p>
+    <w:p>
+      <w:r>
+        <w:rPr>
+          <w:b/>
+          <w:bCs/>
+          <w:u w:val="single"/>
+        </w:rPr>
+        <w:t>Improvements and bugs</w:t>
+      </w:r>
+      <w:r>
+        <w:t>:</w:t>
+      </w:r>
+    </w:p>
+    <w:p>
+      <w:pPr>
+        <w:rPr>
+          <w:sz w:val="20"/>
+          <w:szCs w:val="20"/>
+        </w:rPr>
+      </w:pPr>
+      <w:r>
+        <w:rPr>
+          <w:b/>
+          <w:bCs/>
+          <w:sz w:val="20"/>
+          <w:szCs w:val="20"/>
+        </w:rPr>
+        <w:t xml:space="preserve">1. </w:t>
+      </w:r>
+      <w:r>
+        <w:rPr>
+          <w:b/>
+          <w:bCs/>
+          <w:sz w:val="20"/>
+          <w:szCs w:val="20"/>
+        </w:rPr>
+        <w:t>Adding word counter and character counter (Done)</w:t>
+      </w:r>
+    </w:p>
+    <w:p>
+      <w:pPr>
+        <w:rPr>
+          <w:b/>
+          <w:bCs/>
+          <w:sz w:val="20"/>
+          <w:szCs w:val="20"/>
+        </w:rPr>
+      </w:pPr>
+      <w:r>
+        <w:rPr>
+          <w:b/>
+          <w:bCs/>
+          <w:sz w:val="20"/>
+          <w:szCs w:val="20"/>
+        </w:rPr>
+        <w:t xml:space="preserve">2. </w:t>
+      </w:r>
+      <w:r>
+        <w:rPr>
+          <w:b/>
+          <w:bCs/>
+          <w:sz w:val="20"/>
+          <w:szCs w:val="20"/>
+        </w:rPr>
+        <w:t>Adding star for favourite journals</w:t>
+      </w:r>
+    </w:p>
+    <w:p>
+      <w:pPr>
+        <w:rPr>
+          <w:b/>
+          <w:bCs/>
+          <w:sz w:val="20"/>
+          <w:szCs w:val="20"/>
+        </w:rPr>
+      </w:pPr>
+      <w:r>
+        <w:rPr>
+          <w:sz w:val="20"/>
+          <w:szCs w:val="20"/>
+        </w:rPr>
+        <w:t>We will be adding Star icon for favorite journals and update the backend too.</w:t>
+      </w:r>
+    </w:p>
+    <w:p>
+      <w:pPr>
+        <w:rPr>
+          <w:b/>
+          <w:bCs/>
+          <w:sz w:val="32"/>
+          <w:szCs w:val="32"/>
         </w:rPr>
       </w:pPr>
     </w:p>

</xml_diff>